<commit_message>
Range test as LOS-equivalent: thesis, journal and slides
- Link boundary measured 16.10 on one board pair (HaLow 14 dBm, Wi-Fi 2.4 GHz
  20 dBm), converted to a line-of-sight path by Friis: HaLow link to ~1.55 km,
  video to ~0.31 km; Wi-Fi link to ~0.87 km (x1.8)
- Thesis: methodology in 2.3-2.4, table 3.10 in 3.6, comparison in 3.7,
  conclusions and summary updated; power-regulator proposal added
- Practice journal and slides updated (new slide 14); plan of the test points

Co-Authored-By: Claude Opus 5.5 <noreply@anthropic.com>
</commit_message>
<xml_diff>
--- a/docs/praktika/Zhurnal_praktiki.docx
+++ b/docs/praktika/Zhurnal_praktiki.docx
@@ -6673,7 +6673,7 @@
                 <w:b w:val="0"/>
                 <w:sz w:val="22"/>
               </w:rPr>
-              <w:t>Оценка дальности без выезда в поле</w:t>
+              <w:t>Измерение границы связи</w:t>
             </w:r>
           </w:p>
         </w:tc>
@@ -6687,7 +6687,7 @@
                 <w:b w:val="0"/>
                 <w:sz w:val="22"/>
               </w:rPr>
-              <w:t>опыт эквивалентного затухания в здании и пересчёт по моделям</w:t>
+              <w:t>измерение потерь на трассе в каждом состоянии связи и пересчёт на трассу прямой видимости</w:t>
             </w:r>
           </w:p>
         </w:tc>
@@ -6701,7 +6701,7 @@
                 <w:b w:val="0"/>
                 <w:sz w:val="22"/>
               </w:rPr>
-              <w:t>методика и программа подготовлены</w:t>
+              <w:t>Wi-Fi HaLow: связь до ≈ 1,55 км, видео до ≈ 0,31 км; Wi-Fi 2,4 ГГц: связь до ≈ 0,87 км</w:t>
             </w:r>
           </w:p>
         </w:tc>
@@ -6934,7 +6934,7 @@
         <w:rPr>
           <w:sz w:val="28"/>
         </w:rPr>
-        <w:t xml:space="preserve">– программа опыта эквивалентного затухания с пересчётом результатов на открытую местность.</w:t>
+        <w:t xml:space="preserve">– программа измерения границы связи с пересчётом результатов на трассу прямой видимости.</w:t>
       </w:r>
     </w:p>
     <w:p>
@@ -7065,7 +7065,7 @@
         <w:rPr>
           <w:sz w:val="28"/>
         </w:rPr>
-        <w:t xml:space="preserve">Полевой замер дальности отложен из-за погоды. Вместо него подготовлен опыт эквивалентного затухания: граница связи ищется в здании, где сигнал ослабляют стены и перекрытия, по измеренным потерям трассы и пороговому отношению сигнал/шум, а расстояние на открытой местности вычисляется по моделям распространения. Опыт выполняется для Wi-Fi HaLow и Wi-Fi 2,4 ГГц на разрешённой мощности.</w:t>
+        <w:t xml:space="preserve">Граница связи измерена 16.10.2026 для Wi-Fi HaLow (14 дБм) и Wi-Fi 2,4 ГГц (20 дБм) на одной паре плат и одних и тех же положениях приёмника. Для каждого состояния связи измерялись потери на трассе, а расстояние на трассе прямой видимости с теми же потерями находилось по формуле Фрииса. Видео Wi-Fi HaLow передаётся до ≈ 0,31 км (потери видеокадров 9 %), прекращается на ≈ 1,10 км, связь сохраняется до ≈ 1,55 км; у Wi-Fi 2,4 ГГц видео прекращается на ≈ 0,62 км, связь — до ≈ 0,87 км. Wi-Fi HaLow удерживает связь в 1,8 раза дальше при мощности на 6 дБ ниже; его граница связи на уровне паспортных 1200 м производителя радиомодуля, полученных при +20 дБм.</w:t>
       </w:r>
     </w:p>
     <w:p>
@@ -7144,7 +7144,7 @@
         <w:rPr>
           <w:sz w:val="28"/>
         </w:rPr>
-        <w:t xml:space="preserve">– Для завершения ВКР предстоит выполнить опыт эквивалентного затухания, сопоставить его результаты с расчётом и оформить пояснительную записку.</w:t>
+        <w:t xml:space="preserve">– Измерение границы связи на одной паре плат в пересчёте на трассу прямой видимости: Wi-Fi HaLow удерживает связь до ≈ 1,55 км против ≈ 0,87 км у Wi-Fi 2,4 ГГц, видео передаётся до ≈ 0,31 км.</w:t>
       </w:r>
     </w:p>
     <w:p>

</xml_diff>

<commit_message>
Deck reworked per review: slides 2-15, theory with three charts; thesis text synced
- Deck: requirements-first slide 2, scenarios table on 4, theory slide with
  Friis / Weissberger / two-ray charts, formulas, variable legends and the
  margin breakdown at 14 dBm (5.6 dB, x1.9 vs measured x1.8); slides 6-15
  rewritten (units, grouped "why experiment", stand flow, stage goals,
  clearer steps, delay spread, -53 dBm explained, all range states,
  difficulties/solutions/limits, per-improvement conclusions)
- Thesis: Wi-Fi standard named (802.11n), background noise explained,
  MCS floor by SNR, full-speed range state, delay spread, integration limits,
  Doppler with cos(theta) and how the receiver compensates, margin at 14 dBm
- Figures: clearer throughput step labels, stand scheme without "assembly"
- Journal and economics wording fixes

Co-Authored-By: Claude Opus 5.5 <noreply@anthropic.com>
</commit_message>
<xml_diff>
--- a/docs/praktika/Zhurnal_praktiki.docx
+++ b/docs/praktika/Zhurnal_praktiki.docx
@@ -6317,7 +6317,7 @@
                 <w:b w:val="0"/>
                 <w:sz w:val="20"/>
               </w:rPr>
-              <w:t>разрешённая конфигурация: канал 2 МГц на 867 МГц, мощность не более 14 дБм</w:t>
+              <w:t>разрешённая конфигурация: канал шириной 2 МГц с центральной частотой 867 МГц, мощность не более 14 дБм</w:t>
             </w:r>
           </w:p>
         </w:tc>
@@ -6938,7 +6938,7 @@
         <w:rPr>
           <w:sz w:val="28"/>
         </w:rPr>
-        <w:t xml:space="preserve">– доработки программы радиомодуля: драйвер UART, таймер паузы, регулятор мощности по отношению сигнал/шум, нижняя граница модуляции по уровню сигнала;</w:t>
+        <w:t xml:space="preserve">– доработки программы радиомодуля: драйвер UART, таймер паузы, регулятор мощности по отношению сигнал/шум, нижняя граница модуляции по отношению сигнал/шум;</w:t>
       </w:r>
     </w:p>
     <w:p>
@@ -6951,7 +6951,7 @@
         <w:rPr>
           <w:sz w:val="28"/>
         </w:rPr>
-        <w:t xml:space="preserve">– программа приёма на компьютере: сборка и показ видео, журнал показателей канала — уровня сигнала, отношения сигнал/шум, потерь, задержки и скорости;</w:t>
+        <w:t xml:space="preserve">– программа приёма на компьютере: приём и показ видео, журнал показателей канала — уровня сигнала, отношения сигнал/шум, потерь, задержки и скорости;</w:t>
       </w:r>
     </w:p>
     <w:p>
@@ -7004,7 +7004,7 @@
         <w:rPr>
           <w:sz w:val="28"/>
         </w:rPr>
-        <w:t xml:space="preserve">Испытания проводились в два этапа. На лабораторном этапе (до 28.09.2026) платы располагались в помещении на расстоянии до 5 м в заводском канале 4 МГц; сигнал был сильным, поэтому искались ограничения самой платформы. С 28.09.2026 стенд работает в разрешённой конфигурации: канал 2 МГц на 867 МГц, мощность не более 14 дБм, камера — в соседней комнате на расстоянии около 5 м.</w:t>
+        <w:t xml:space="preserve">Испытания проводились в два этапа. На лабораторном этапе (до 28.09.2026) платы располагались в помещении на расстоянии до 5 м в заводском канале 4 МГц; сигнал был сильным, поэтому искались ограничения самой платформы. С 28.09.2026 стенд работает в разрешённой конфигурации: канал шириной 2 МГц с центральной частотой 867 МГц, мощность не более 14 дБм, камера — в соседней комнате на расстоянии около 5 м.</w:t>
       </w:r>
     </w:p>
     <w:p>
@@ -7082,7 +7082,7 @@
         <w:rPr>
           <w:sz w:val="28"/>
         </w:rPr>
-        <w:t xml:space="preserve">Поскольку канал теряет заметную долю передач, доработки последнего этапа направлены на надёжность: выключен обмен RTS/CTS, лишний в сети из двух узлов [1], что подняло скорость в 1,8–2,2 раза; камера переведена в роль точки доступа и передаёт видео адресно; введены квитанция на видеокадр с окном, гибрид помехоустойчивого кодирования и досылки, инерция управления качеством и нижняя граница модуляции по уровню сигнала. Каждая доработка проверена поочерёдным включением и выключением в одном опыте.</w:t>
+        <w:t xml:space="preserve">Поскольку канал теряет заметную долю передач, доработки последнего этапа направлены на надёжность: выключен обмен RTS/CTS, лишний в сети из двух узлов [1], что подняло скорость в 1,8–2,2 раза; камера переведена в роль точки доступа и передаёт видео адресно; введены квитанция на видеокадр с окном, гибрид помехоустойчивого кодирования и досылки, инерция управления качеством и нижняя граница модуляции по отношению сигнал/шум. Каждая доработка проверена поочерёдным включением и выключением в одном опыте.</w:t>
       </w:r>
     </w:p>
     <w:p>
@@ -7106,7 +7106,7 @@
       <w:r>
         <w:drawing>
           <wp:inline xmlns:a="http://schemas.openxmlformats.org/drawingml/2006/main" xmlns:pic="http://schemas.openxmlformats.org/drawingml/2006/picture">
-            <wp:extent cx="5760000" cy="3433160"/>
+            <wp:extent cx="5760000" cy="3286548"/>
             <wp:docPr id="2" name="Picture 2"/>
             <wp:cNvGraphicFramePr>
               <a:graphicFrameLocks noChangeAspect="1"/>
@@ -7127,7 +7127,7 @@
                   <pic:spPr>
                     <a:xfrm>
                       <a:off x="0" y="0"/>
-                      <a:ext cx="5760000" cy="3433160"/>
+                      <a:ext cx="5760000" cy="3286548"/>
                     </a:xfrm>
                     <a:prstGeom prst="rect"/>
                   </pic:spPr>

</xml_diff>

<commit_message>
Rebuild: margin over Wi-Fi at 14 dBm (5.6 dB, x1.9) in thesis and journal
Co-Authored-By: Claude Opus 5.5 <noreply@anthropic.com>
</commit_message>
<xml_diff>
--- a/docs/praktika/Zhurnal_praktiki.docx
+++ b/docs/praktika/Zhurnal_praktiki.docx
@@ -6256,7 +6256,7 @@
                 <w:b w:val="0"/>
                 <w:sz w:val="20"/>
               </w:rPr>
-              <w:t>выбран Wi-Fi HaLow: при нормах РФ запас бюджета на 7,7 дБ больше, чем у Wi-Fi 2,4 ГГц, скорость достаточна для видео</w:t>
+              <w:t>выбран Wi-Fi HaLow: при нормах РФ запас бюджета на 5,6 дБ больше, чем у Wi-Fi 2,4 ГГц, скорость достаточна для видео</w:t>
             </w:r>
           </w:p>
         </w:tc>
@@ -7200,7 +7200,7 @@
         <w:rPr>
           <w:sz w:val="28"/>
         </w:rPr>
-        <w:t xml:space="preserve">– По нормам РФ Wi-Fi HaLow выигрывает у Wi-Fi 2,4 ГГц на малых скоростях и за препятствиями (запас бюджета на 7,7 дБ больше), уступает ему в скорости на порядок и превосходит LoRa по скорости на два–три порядка [1, 3, 4].</w:t>
+        <w:t xml:space="preserve">– По нормам РФ Wi-Fi HaLow выигрывает у Wi-Fi 2,4 ГГц на малых скоростях и за препятствиями (запас бюджета на 5,6 дБ больше), уступает ему в скорости на порядок и превосходит LoRa по скорости на два–три порядка [1, 3, 4].</w:t>
       </w:r>
     </w:p>
     <w:p>

</xml_diff>